<commit_message>
adiciona suporte a múltiplas fotos na vistoria (painel + veículo)
Co-Authored-By: Claude Sonnet 4.6 <noreply@anthropic.com>
</commit_message>
<xml_diff>
--- a/docx_templates/VISTORIA_TEMPLATE1_marcado.docx
+++ b/docx_templates/VISTORIA_TEMPLATE1_marcado.docx
@@ -666,25 +666,7 @@
                 <w:sz w:val="18"/>
                 <w:szCs w:val="18"/>
               </w:rPr>
-              <w:t>[</w:t>
-            </w:r>
-            <w:proofErr w:type="spellStart"/>
-            <w:r>
-              <w:rPr>
-                <w:color w:val="333333"/>
-                <w:sz w:val="18"/>
-                <w:szCs w:val="18"/>
-              </w:rPr>
-              <w:t>combustivel</w:t>
-            </w:r>
-            <w:proofErr w:type="spellEnd"/>
-            <w:r>
-              <w:rPr>
-                <w:color w:val="333333"/>
-                <w:sz w:val="18"/>
-                <w:szCs w:val="18"/>
-              </w:rPr>
-              <w:t>]</w:t>
+              <w:t>[combustivel]</w:t>
             </w:r>
           </w:p>
         </w:tc>
@@ -1055,7 +1037,6 @@
             <w:vAlign w:val="center"/>
           </w:tcPr>
           <w:p>
-            <w:proofErr w:type="spellStart"/>
             <w:r>
               <w:rPr>
                 <w:b/>
@@ -1064,18 +1045,7 @@
                 <w:sz w:val="18"/>
                 <w:szCs w:val="18"/>
               </w:rPr>
-              <w:t>Hodôm</w:t>
-            </w:r>
-            <w:proofErr w:type="spellEnd"/>
-            <w:r>
-              <w:rPr>
-                <w:b/>
-                <w:bCs/>
-                <w:color w:val="1A1A1A"/>
-                <w:sz w:val="18"/>
-                <w:szCs w:val="18"/>
-              </w:rPr>
-              <w:t>. Entrega</w:t>
+              <w:t>Hodôm. Entrega</w:t>
             </w:r>
           </w:p>
         </w:tc>
@@ -1200,18 +1170,7 @@
           <w:sz w:val="18"/>
           <w:szCs w:val="18"/>
         </w:rPr>
-        <w:t xml:space="preserve">  </w:t>
-      </w:r>
-      <w:proofErr w:type="gramStart"/>
-      <w:r>
-        <w:rPr>
-          <w:b/>
-          <w:bCs/>
-          <w:color w:val="1A6B1A"/>
-          <w:sz w:val="18"/>
-          <w:szCs w:val="18"/>
-        </w:rPr>
-        <w:t xml:space="preserve">S  </w:t>
+        <w:t xml:space="preserve">  S  </w:t>
       </w:r>
       <w:r>
         <w:rPr>
@@ -1219,16 +1178,7 @@
           <w:sz w:val="18"/>
           <w:szCs w:val="18"/>
         </w:rPr>
-        <w:t>=</w:t>
-      </w:r>
-      <w:proofErr w:type="gramEnd"/>
-      <w:r>
-        <w:rPr>
-          <w:color w:val="444444"/>
-          <w:sz w:val="18"/>
-          <w:szCs w:val="18"/>
-        </w:rPr>
-        <w:t xml:space="preserve"> Sim existente     </w:t>
+        <w:t xml:space="preserve">= Sim existente     </w:t>
       </w:r>
       <w:r>
         <w:rPr>
@@ -1238,18 +1188,7 @@
           <w:sz w:val="18"/>
           <w:szCs w:val="18"/>
         </w:rPr>
-        <w:t xml:space="preserve">  </w:t>
-      </w:r>
-      <w:proofErr w:type="gramStart"/>
-      <w:r>
-        <w:rPr>
-          <w:b/>
-          <w:bCs/>
-          <w:color w:val="8B0000"/>
-          <w:sz w:val="18"/>
-          <w:szCs w:val="18"/>
-        </w:rPr>
-        <w:t xml:space="preserve">N  </w:t>
+        <w:t xml:space="preserve">  N  </w:t>
       </w:r>
       <w:r>
         <w:rPr>
@@ -1257,16 +1196,7 @@
           <w:sz w:val="18"/>
           <w:szCs w:val="18"/>
         </w:rPr>
-        <w:t>=</w:t>
-      </w:r>
-      <w:proofErr w:type="gramEnd"/>
-      <w:r>
-        <w:rPr>
-          <w:color w:val="444444"/>
-          <w:sz w:val="18"/>
-          <w:szCs w:val="18"/>
-        </w:rPr>
-        <w:t xml:space="preserve"> Não existente     </w:t>
+        <w:t xml:space="preserve">= Não existente     </w:t>
       </w:r>
       <w:r>
         <w:rPr>
@@ -1276,18 +1206,7 @@
           <w:sz w:val="18"/>
           <w:szCs w:val="18"/>
         </w:rPr>
-        <w:t xml:space="preserve">  </w:t>
-      </w:r>
-      <w:proofErr w:type="gramStart"/>
-      <w:r>
-        <w:rPr>
-          <w:b/>
-          <w:bCs/>
-          <w:color w:val="7A5C00"/>
-          <w:sz w:val="18"/>
-          <w:szCs w:val="18"/>
-        </w:rPr>
-        <w:t xml:space="preserve">A  </w:t>
+        <w:t xml:space="preserve">  A  </w:t>
       </w:r>
       <w:r>
         <w:rPr>
@@ -1295,16 +1214,7 @@
           <w:sz w:val="18"/>
           <w:szCs w:val="18"/>
         </w:rPr>
-        <w:t>=</w:t>
-      </w:r>
-      <w:proofErr w:type="gramEnd"/>
-      <w:r>
-        <w:rPr>
-          <w:color w:val="444444"/>
-          <w:sz w:val="18"/>
-          <w:szCs w:val="18"/>
-        </w:rPr>
-        <w:t xml:space="preserve"> Avariado</w:t>
+        <w:t>= Avariado</w:t>
       </w:r>
     </w:p>
     <w:tbl>
@@ -1541,23 +1451,7 @@
                 <w:sz w:val="17"/>
                 <w:szCs w:val="17"/>
               </w:rPr>
-              <w:t xml:space="preserve">Triângulo </w:t>
-            </w:r>
-            <w:proofErr w:type="spellStart"/>
-            <w:r>
-              <w:rPr>
-                <w:sz w:val="17"/>
-                <w:szCs w:val="17"/>
-              </w:rPr>
-              <w:t>Sinaliz</w:t>
-            </w:r>
-            <w:proofErr w:type="spellEnd"/>
-            <w:r>
-              <w:rPr>
-                <w:sz w:val="17"/>
-                <w:szCs w:val="17"/>
-              </w:rPr>
-              <w:t>.</w:t>
+              <w:t>Triângulo Sinaliz.</w:t>
             </w:r>
           </w:p>
         </w:tc>
@@ -2353,21 +2247,12 @@
             </w:tcMar>
           </w:tcPr>
           <w:p>
-            <w:proofErr w:type="spellStart"/>
             <w:r>
               <w:rPr>
                 <w:sz w:val="17"/>
                 <w:szCs w:val="17"/>
               </w:rPr>
-              <w:t>Func</w:t>
-            </w:r>
-            <w:proofErr w:type="spellEnd"/>
-            <w:r>
-              <w:rPr>
-                <w:sz w:val="17"/>
-                <w:szCs w:val="17"/>
-              </w:rPr>
-              <w:t>. GNV</w:t>
+              <w:t>Func. GNV</w:t>
             </w:r>
           </w:p>
         </w:tc>
@@ -2861,23 +2746,7 @@
                 <w:sz w:val="17"/>
                 <w:szCs w:val="17"/>
               </w:rPr>
-              <w:t xml:space="preserve">Borracha PSG </w:t>
-            </w:r>
-            <w:proofErr w:type="spellStart"/>
-            <w:r>
-              <w:rPr>
-                <w:sz w:val="17"/>
-                <w:szCs w:val="17"/>
-              </w:rPr>
-              <w:t>Tras</w:t>
-            </w:r>
-            <w:proofErr w:type="spellEnd"/>
-            <w:r>
-              <w:rPr>
-                <w:sz w:val="17"/>
-                <w:szCs w:val="17"/>
-              </w:rPr>
-              <w:t>.</w:t>
+              <w:t>Borracha PSG Tras.</w:t>
             </w:r>
           </w:p>
         </w:tc>
@@ -2938,23 +2807,7 @@
                 <w:sz w:val="17"/>
                 <w:szCs w:val="17"/>
               </w:rPr>
-              <w:t xml:space="preserve">Borracha MTR </w:t>
-            </w:r>
-            <w:proofErr w:type="spellStart"/>
-            <w:r>
-              <w:rPr>
-                <w:sz w:val="17"/>
-                <w:szCs w:val="17"/>
-              </w:rPr>
-              <w:t>Tras</w:t>
-            </w:r>
-            <w:proofErr w:type="spellEnd"/>
-            <w:r>
-              <w:rPr>
-                <w:sz w:val="17"/>
-                <w:szCs w:val="17"/>
-              </w:rPr>
-              <w:t>.</w:t>
+              <w:t>Borracha MTR Tras.</w:t>
             </w:r>
           </w:p>
         </w:tc>
@@ -3875,7 +3728,27 @@
           <w:sz w:val="22"/>
           <w:szCs w:val="22"/>
         </w:rPr>
-        <w:t>7. LUZES DO PAINEL ACESAS:</w:t>
+        <w:t xml:space="preserve">7. </w:t>
+      </w:r>
+      <w:r>
+        <w:rPr>
+          <w:b/>
+          <w:bCs/>
+          <w:color w:val="2C5F8A"/>
+          <w:sz w:val="22"/>
+          <w:szCs w:val="22"/>
+        </w:rPr>
+        <w:t>IMAGENS DO PAINEL E DO VEÍCULO</w:t>
+      </w:r>
+      <w:r>
+        <w:rPr>
+          <w:b/>
+          <w:bCs/>
+          <w:color w:val="2C5F8A"/>
+          <w:sz w:val="22"/>
+          <w:szCs w:val="22"/>
+        </w:rPr>
+        <w:t>:</w:t>
       </w:r>
       <w:r>
         <w:rPr>

</xml_diff>

<commit_message>
atualiza template de vistoria (VISTORIA_TEMPLATE1_marcado.docx)
Co-Authored-By: Claude Sonnet 4.6 <noreply@anthropic.com>
</commit_message>
<xml_diff>
--- a/docx_templates/VISTORIA_TEMPLATE1_marcado.docx
+++ b/docx_templates/VISTORIA_TEMPLATE1_marcado.docx
@@ -4324,51 +4324,6 @@
           <w:bottom w:val="single" w:sz="6" w:space="4" w:color="2C5F8A"/>
         </w:pBdr>
         <w:spacing w:before="280" w:after="100"/>
-        <w:rPr>
-          <w:b/>
-          <w:bCs/>
-          <w:color w:val="2C5F8A"/>
-          <w:sz w:val="22"/>
-          <w:szCs w:val="22"/>
-        </w:rPr>
-      </w:pPr>
-    </w:p>
-    <w:p>
-      <w:pPr>
-        <w:pBdr>
-          <w:bottom w:val="single" w:sz="6" w:space="4" w:color="2C5F8A"/>
-        </w:pBdr>
-        <w:spacing w:before="280" w:after="100"/>
-        <w:rPr>
-          <w:b/>
-          <w:bCs/>
-          <w:color w:val="2C5F8A"/>
-          <w:sz w:val="22"/>
-          <w:szCs w:val="22"/>
-        </w:rPr>
-      </w:pPr>
-    </w:p>
-    <w:p>
-      <w:pPr>
-        <w:pBdr>
-          <w:bottom w:val="single" w:sz="6" w:space="4" w:color="2C5F8A"/>
-        </w:pBdr>
-        <w:spacing w:before="280" w:after="100"/>
-        <w:rPr>
-          <w:b/>
-          <w:bCs/>
-          <w:color w:val="2C5F8A"/>
-          <w:sz w:val="22"/>
-          <w:szCs w:val="22"/>
-        </w:rPr>
-      </w:pPr>
-    </w:p>
-    <w:p>
-      <w:pPr>
-        <w:pBdr>
-          <w:bottom w:val="single" w:sz="6" w:space="4" w:color="2C5F8A"/>
-        </w:pBdr>
-        <w:spacing w:before="280" w:after="100"/>
       </w:pPr>
       <w:r>
         <w:rPr>
@@ -4380,24 +4335,77 @@
         </w:rPr>
         <w:t>5. DANOS OU AVARIAS INTERNAS DO VEÍCULO:</w:t>
       </w:r>
-    </w:p>
-    <w:p>
-      <w:pPr>
-        <w:pBdr>
-          <w:bottom w:val="single" w:sz="6" w:space="4" w:color="2C5F8A"/>
-        </w:pBdr>
-        <w:tabs>
-          <w:tab w:val="left" w:pos="3660"/>
-        </w:tabs>
-        <w:spacing w:before="280" w:after="100"/>
+      <w:r>
         <w:rPr>
-          <w:b/>
-          <w:bCs/>
-          <w:color w:val="2C5F8A"/>
-          <w:sz w:val="22"/>
-          <w:szCs w:val="22"/>
+          <w:noProof/>
         </w:rPr>
-      </w:pPr>
+        <w:drawing>
+          <wp:anchor distT="0" distB="0" distL="114300" distR="114300" simplePos="0" relativeHeight="251658240" behindDoc="0" locked="0" layoutInCell="1" allowOverlap="1" wp14:anchorId="4E16B9B9" wp14:editId="3D7AAF29">
+            <wp:simplePos x="0" y="0"/>
+            <wp:positionH relativeFrom="margin">
+              <wp:posOffset>-196850</wp:posOffset>
+            </wp:positionH>
+            <wp:positionV relativeFrom="paragraph">
+              <wp:posOffset>546100</wp:posOffset>
+            </wp:positionV>
+            <wp:extent cx="3752850" cy="1755140"/>
+            <wp:effectExtent l="0" t="0" r="0" b="0"/>
+            <wp:wrapSquare wrapText="bothSides"/>
+            <wp:docPr id="19" name="image10.png" title="Imagem">
+              <a:extLst xmlns:a="http://schemas.openxmlformats.org/drawingml/2006/main">
+                <a:ext uri="{FF2B5EF4-FFF2-40B4-BE49-F238E27FC236}">
+                  <a16:creationId xmlns:a16="http://schemas.microsoft.com/office/drawing/2014/main" id="{00000000-0008-0000-0000-000013000000}"/>
+                </a:ext>
+              </a:extLst>
+            </wp:docPr>
+            <wp:cNvGraphicFramePr/>
+            <a:graphic xmlns:a="http://schemas.openxmlformats.org/drawingml/2006/main">
+              <a:graphicData uri="http://schemas.openxmlformats.org/drawingml/2006/picture">
+                <pic:pic xmlns:pic="http://schemas.openxmlformats.org/drawingml/2006/picture">
+                  <pic:nvPicPr>
+                    <pic:cNvPr id="19" name="image10.png" title="Imagem">
+                      <a:extLst>
+                        <a:ext uri="{FF2B5EF4-FFF2-40B4-BE49-F238E27FC236}">
+                          <a16:creationId xmlns:a16="http://schemas.microsoft.com/office/drawing/2014/main" id="{00000000-0008-0000-0000-000013000000}"/>
+                        </a:ext>
+                      </a:extLst>
+                    </pic:cNvPr>
+                    <pic:cNvPicPr preferRelativeResize="0"/>
+                  </pic:nvPicPr>
+                  <pic:blipFill>
+                    <a:blip r:embed="rId6" cstate="print">
+                      <a:extLst>
+                        <a:ext uri="{28A0092B-C50C-407E-A947-70E740481C1C}">
+                          <a14:useLocalDpi xmlns:a14="http://schemas.microsoft.com/office/drawing/2010/main" val="0"/>
+                        </a:ext>
+                      </a:extLst>
+                    </a:blip>
+                    <a:stretch>
+                      <a:fillRect/>
+                    </a:stretch>
+                  </pic:blipFill>
+                  <pic:spPr>
+                    <a:xfrm>
+                      <a:off x="0" y="0"/>
+                      <a:ext cx="3752850" cy="1755140"/>
+                    </a:xfrm>
+                    <a:prstGeom prst="rect">
+                      <a:avLst/>
+                    </a:prstGeom>
+                    <a:noFill/>
+                  </pic:spPr>
+                </pic:pic>
+              </a:graphicData>
+            </a:graphic>
+            <wp14:sizeRelH relativeFrom="margin">
+              <wp14:pctWidth>0</wp14:pctWidth>
+            </wp14:sizeRelH>
+            <wp14:sizeRelV relativeFrom="margin">
+              <wp14:pctHeight>0</wp14:pctHeight>
+            </wp14:sizeRelV>
+          </wp:anchor>
+        </w:drawing>
+      </w:r>
     </w:p>
     <w:p>
       <w:pPr>
@@ -4439,13 +4447,13 @@
           <w:noProof/>
         </w:rPr>
         <w:drawing>
-          <wp:anchor distT="0" distB="0" distL="114300" distR="114300" simplePos="0" relativeHeight="251660288" behindDoc="0" locked="0" layoutInCell="1" allowOverlap="1" wp14:anchorId="1E4C55E6" wp14:editId="43F2323C">
+          <wp:anchor distT="0" distB="0" distL="114300" distR="114300" simplePos="0" relativeHeight="251660288" behindDoc="0" locked="0" layoutInCell="1" allowOverlap="1" wp14:anchorId="1E4C55E6" wp14:editId="2F728641">
             <wp:simplePos x="0" y="0"/>
             <wp:positionH relativeFrom="margin">
-              <wp:posOffset>3604260</wp:posOffset>
+              <wp:posOffset>3603625</wp:posOffset>
             </wp:positionH>
-            <wp:positionV relativeFrom="page">
-              <wp:posOffset>3352165</wp:posOffset>
+            <wp:positionV relativeFrom="paragraph">
+              <wp:posOffset>-213995</wp:posOffset>
             </wp:positionV>
             <wp:extent cx="2686050" cy="3552825"/>
             <wp:effectExtent l="0" t="0" r="0" b="9525"/>
@@ -4472,7 +4480,7 @@
                     <pic:cNvPicPr preferRelativeResize="0"/>
                   </pic:nvPicPr>
                   <pic:blipFill>
-                    <a:blip r:embed="rId6" cstate="print">
+                    <a:blip r:embed="rId7" cstate="print">
                       <a:extLst>
                         <a:ext uri="{28A0092B-C50C-407E-A947-70E740481C1C}">
                           <a14:useLocalDpi xmlns:a14="http://schemas.microsoft.com/office/drawing/2010/main" val="0"/>
@@ -4510,13 +4518,13 @@
           <w:noProof/>
         </w:rPr>
         <w:drawing>
-          <wp:anchor distT="0" distB="0" distL="114300" distR="114300" simplePos="0" relativeHeight="251659264" behindDoc="0" locked="0" layoutInCell="1" allowOverlap="1" wp14:anchorId="5A473A9B" wp14:editId="5F7C706F">
+          <wp:anchor distT="0" distB="0" distL="114300" distR="114300" simplePos="0" relativeHeight="251659264" behindDoc="0" locked="0" layoutInCell="1" allowOverlap="1" wp14:anchorId="5A473A9B" wp14:editId="6CA24434">
             <wp:simplePos x="0" y="0"/>
             <wp:positionH relativeFrom="margin">
               <wp:posOffset>-206375</wp:posOffset>
             </wp:positionH>
-            <wp:positionV relativeFrom="page">
-              <wp:posOffset>5162550</wp:posOffset>
+            <wp:positionV relativeFrom="paragraph">
+              <wp:posOffset>-264795</wp:posOffset>
             </wp:positionV>
             <wp:extent cx="3790950" cy="1733550"/>
             <wp:effectExtent l="0" t="0" r="0" b="0"/>
@@ -4543,7 +4551,7 @@
                     <pic:cNvPicPr preferRelativeResize="0"/>
                   </pic:nvPicPr>
                   <pic:blipFill>
-                    <a:blip r:embed="rId7" cstate="print">
+                    <a:blip r:embed="rId8" cstate="print">
                       <a:extLst>
                         <a:ext uri="{28A0092B-C50C-407E-A947-70E740481C1C}">
                           <a14:useLocalDpi xmlns:a14="http://schemas.microsoft.com/office/drawing/2010/main" val="0"/>
@@ -4558,77 +4566,6 @@
                     <a:xfrm>
                       <a:off x="0" y="0"/>
                       <a:ext cx="3790950" cy="1733550"/>
-                    </a:xfrm>
-                    <a:prstGeom prst="rect">
-                      <a:avLst/>
-                    </a:prstGeom>
-                    <a:noFill/>
-                  </pic:spPr>
-                </pic:pic>
-              </a:graphicData>
-            </a:graphic>
-            <wp14:sizeRelH relativeFrom="margin">
-              <wp14:pctWidth>0</wp14:pctWidth>
-            </wp14:sizeRelH>
-            <wp14:sizeRelV relativeFrom="margin">
-              <wp14:pctHeight>0</wp14:pctHeight>
-            </wp14:sizeRelV>
-          </wp:anchor>
-        </w:drawing>
-      </w:r>
-      <w:r>
-        <w:rPr>
-          <w:noProof/>
-        </w:rPr>
-        <w:drawing>
-          <wp:anchor distT="0" distB="0" distL="114300" distR="114300" simplePos="0" relativeHeight="251658240" behindDoc="0" locked="0" layoutInCell="1" allowOverlap="1" wp14:anchorId="4E16B9B9" wp14:editId="622DF076">
-            <wp:simplePos x="0" y="0"/>
-            <wp:positionH relativeFrom="margin">
-              <wp:posOffset>-187325</wp:posOffset>
-            </wp:positionH>
-            <wp:positionV relativeFrom="page">
-              <wp:posOffset>3333750</wp:posOffset>
-            </wp:positionV>
-            <wp:extent cx="3752850" cy="1755140"/>
-            <wp:effectExtent l="0" t="0" r="0" b="0"/>
-            <wp:wrapSquare wrapText="bothSides"/>
-            <wp:docPr id="19" name="image10.png" title="Imagem">
-              <a:extLst xmlns:a="http://schemas.openxmlformats.org/drawingml/2006/main">
-                <a:ext uri="{FF2B5EF4-FFF2-40B4-BE49-F238E27FC236}">
-                  <a16:creationId xmlns:a16="http://schemas.microsoft.com/office/drawing/2014/main" id="{00000000-0008-0000-0000-000013000000}"/>
-                </a:ext>
-              </a:extLst>
-            </wp:docPr>
-            <wp:cNvGraphicFramePr/>
-            <a:graphic xmlns:a="http://schemas.openxmlformats.org/drawingml/2006/main">
-              <a:graphicData uri="http://schemas.openxmlformats.org/drawingml/2006/picture">
-                <pic:pic xmlns:pic="http://schemas.openxmlformats.org/drawingml/2006/picture">
-                  <pic:nvPicPr>
-                    <pic:cNvPr id="19" name="image10.png" title="Imagem">
-                      <a:extLst>
-                        <a:ext uri="{FF2B5EF4-FFF2-40B4-BE49-F238E27FC236}">
-                          <a16:creationId xmlns:a16="http://schemas.microsoft.com/office/drawing/2014/main" id="{00000000-0008-0000-0000-000013000000}"/>
-                        </a:ext>
-                      </a:extLst>
-                    </pic:cNvPr>
-                    <pic:cNvPicPr preferRelativeResize="0"/>
-                  </pic:nvPicPr>
-                  <pic:blipFill>
-                    <a:blip r:embed="rId8" cstate="print">
-                      <a:extLst>
-                        <a:ext uri="{28A0092B-C50C-407E-A947-70E740481C1C}">
-                          <a14:useLocalDpi xmlns:a14="http://schemas.microsoft.com/office/drawing/2010/main" val="0"/>
-                        </a:ext>
-                      </a:extLst>
-                    </a:blip>
-                    <a:stretch>
-                      <a:fillRect/>
-                    </a:stretch>
-                  </pic:blipFill>
-                  <pic:spPr>
-                    <a:xfrm>
-                      <a:off x="0" y="0"/>
-                      <a:ext cx="3752850" cy="1755140"/>
                     </a:xfrm>
                     <a:prstGeom prst="rect">
                       <a:avLst/>

</xml_diff>

<commit_message>
atualiza template vistoria: adiciona placeholder [desc_sintomas]
Co-Authored-By: Claude Sonnet 4.6 <noreply@anthropic.com>
</commit_message>
<xml_diff>
--- a/docx_templates/VISTORIA_TEMPLATE1_marcado.docx
+++ b/docx_templates/VISTORIA_TEMPLATE1_marcado.docx
@@ -1781,7 +1781,7 @@
               <w:rPr>
                 <w:b/>
                 <w:bCs/>
-                <w:color w:val="8B0000"/>
+                <w:color w:val="275317" w:themeColor="accent6" w:themeShade="80"/>
                 <w:sz w:val="18"/>
                 <w:szCs w:val="18"/>
               </w:rPr>
@@ -1792,7 +1792,7 @@
               <w:rPr>
                 <w:b/>
                 <w:bCs/>
-                <w:color w:val="8B0000"/>
+                <w:color w:val="275317" w:themeColor="accent6" w:themeShade="80"/>
                 <w:sz w:val="18"/>
                 <w:szCs w:val="18"/>
               </w:rPr>
@@ -1803,7 +1803,7 @@
               <w:rPr>
                 <w:b/>
                 <w:bCs/>
-                <w:color w:val="8B0000"/>
+                <w:color w:val="275317" w:themeColor="accent6" w:themeShade="80"/>
                 <w:sz w:val="18"/>
                 <w:szCs w:val="18"/>
               </w:rPr>
@@ -2032,7 +2032,7 @@
               <w:rPr>
                 <w:b/>
                 <w:bCs/>
-                <w:color w:val="7A5C00"/>
+                <w:color w:val="275317" w:themeColor="accent6" w:themeShade="80"/>
                 <w:sz w:val="18"/>
                 <w:szCs w:val="18"/>
               </w:rPr>
@@ -2043,7 +2043,7 @@
               <w:rPr>
                 <w:b/>
                 <w:bCs/>
-                <w:color w:val="7A5C00"/>
+                <w:color w:val="275317" w:themeColor="accent6" w:themeShade="80"/>
                 <w:sz w:val="18"/>
                 <w:szCs w:val="18"/>
               </w:rPr>
@@ -2054,7 +2054,7 @@
               <w:rPr>
                 <w:b/>
                 <w:bCs/>
-                <w:color w:val="7A5C00"/>
+                <w:color w:val="275317" w:themeColor="accent6" w:themeShade="80"/>
                 <w:sz w:val="18"/>
                 <w:szCs w:val="18"/>
               </w:rPr>
@@ -2794,7 +2794,7 @@
               <w:rPr>
                 <w:b/>
                 <w:bCs/>
-                <w:color w:val="8B0000"/>
+                <w:color w:val="275317" w:themeColor="accent6" w:themeShade="80"/>
                 <w:sz w:val="18"/>
                 <w:szCs w:val="18"/>
               </w:rPr>
@@ -2805,7 +2805,7 @@
               <w:rPr>
                 <w:b/>
                 <w:bCs/>
-                <w:color w:val="8B0000"/>
+                <w:color w:val="275317" w:themeColor="accent6" w:themeShade="80"/>
                 <w:sz w:val="18"/>
                 <w:szCs w:val="18"/>
               </w:rPr>
@@ -2816,7 +2816,7 @@
               <w:rPr>
                 <w:b/>
                 <w:bCs/>
-                <w:color w:val="8B0000"/>
+                <w:color w:val="275317" w:themeColor="accent6" w:themeShade="80"/>
                 <w:sz w:val="18"/>
                 <w:szCs w:val="18"/>
               </w:rPr>
@@ -3045,7 +3045,7 @@
               <w:rPr>
                 <w:b/>
                 <w:bCs/>
-                <w:color w:val="7A5C00"/>
+                <w:color w:val="275317" w:themeColor="accent6" w:themeShade="80"/>
                 <w:sz w:val="18"/>
                 <w:szCs w:val="18"/>
               </w:rPr>
@@ -3056,7 +3056,7 @@
               <w:rPr>
                 <w:b/>
                 <w:bCs/>
-                <w:color w:val="7A5C00"/>
+                <w:color w:val="275317" w:themeColor="accent6" w:themeShade="80"/>
                 <w:sz w:val="18"/>
                 <w:szCs w:val="18"/>
               </w:rPr>
@@ -3067,7 +3067,7 @@
               <w:rPr>
                 <w:b/>
                 <w:bCs/>
-                <w:color w:val="7A5C00"/>
+                <w:color w:val="275317" w:themeColor="accent6" w:themeShade="80"/>
                 <w:sz w:val="18"/>
                 <w:szCs w:val="18"/>
               </w:rPr>
@@ -4079,8 +4079,61 @@
             </w:pPr>
           </w:p>
           <w:p/>
+          <w:p/>
         </w:tc>
       </w:tr>
+    </w:tbl>
+    <w:p>
+      <w:pPr>
+        <w:pBdr>
+          <w:bottom w:val="single" w:sz="6" w:space="4" w:color="2C5F8A"/>
+        </w:pBdr>
+        <w:spacing w:before="280" w:after="100"/>
+        <w:rPr>
+          <w:b/>
+          <w:bCs/>
+          <w:color w:val="2C5F8A"/>
+          <w:sz w:val="22"/>
+          <w:szCs w:val="22"/>
+        </w:rPr>
+      </w:pPr>
+    </w:p>
+    <w:p>
+      <w:pPr>
+        <w:pBdr>
+          <w:bottom w:val="single" w:sz="6" w:space="4" w:color="2C5F8A"/>
+        </w:pBdr>
+        <w:spacing w:before="280" w:after="100"/>
+        <w:rPr>
+          <w:b/>
+          <w:bCs/>
+          <w:color w:val="2C5F8A"/>
+          <w:sz w:val="22"/>
+          <w:szCs w:val="22"/>
+        </w:rPr>
+      </w:pPr>
+    </w:p>
+    <w:tbl>
+      <w:tblPr>
+        <w:tblW w:w="9360" w:type="dxa"/>
+        <w:tblBorders>
+          <w:top w:val="single" w:sz="4" w:space="0" w:color="auto"/>
+          <w:left w:val="single" w:sz="4" w:space="0" w:color="auto"/>
+          <w:bottom w:val="single" w:sz="4" w:space="0" w:color="auto"/>
+          <w:right w:val="single" w:sz="4" w:space="0" w:color="auto"/>
+          <w:insideH w:val="single" w:sz="4" w:space="0" w:color="auto"/>
+          <w:insideV w:val="single" w:sz="4" w:space="0" w:color="auto"/>
+        </w:tblBorders>
+        <w:tblCellMar>
+          <w:left w:w="10" w:type="dxa"/>
+          <w:right w:w="10" w:type="dxa"/>
+        </w:tblCellMar>
+        <w:tblLook w:val="04A0" w:firstRow="1" w:lastRow="0" w:firstColumn="1" w:lastColumn="0" w:noHBand="0" w:noVBand="1"/>
+      </w:tblPr>
+      <w:tblGrid>
+        <w:gridCol w:w="2400"/>
+        <w:gridCol w:w="6960"/>
+      </w:tblGrid>
       <w:tr>
         <w:tc>
           <w:tcPr>
@@ -4109,6 +4162,7 @@
                 <w:sz w:val="18"/>
                 <w:szCs w:val="18"/>
               </w:rPr>
+              <w:lastRenderedPageBreak/>
               <w:t>Descrição Sintomas</w:t>
             </w:r>
           </w:p>
@@ -4166,6 +4220,7 @@
               <w:t>]</w:t>
             </w:r>
           </w:p>
+          <w:p/>
           <w:p/>
           <w:p/>
         </w:tc>
@@ -4225,6 +4280,17 @@
         </w:rPr>
         <w:t>5. DANOS OU AVARIAS INTERNAS DO VEÍCULO</w:t>
       </w:r>
+    </w:p>
+    <w:p>
+      <w:pPr>
+        <w:rPr>
+          <w:b/>
+          <w:bCs/>
+          <w:color w:val="2C5F8A"/>
+          <w:sz w:val="22"/>
+          <w:szCs w:val="22"/>
+        </w:rPr>
+      </w:pPr>
     </w:p>
     <w:p>
       <w:pPr>
@@ -4437,32 +4503,6 @@
     </w:p>
     <w:p>
       <w:pPr>
-        <w:pBdr>
-          <w:bottom w:val="single" w:sz="6" w:space="4" w:color="2C5F8A"/>
-        </w:pBdr>
-        <w:tabs>
-          <w:tab w:val="left" w:pos="3660"/>
-        </w:tabs>
-        <w:spacing w:before="280" w:after="100"/>
-        <w:jc w:val="center"/>
-        <w:rPr>
-          <w:b/>
-          <w:bCs/>
-          <w:color w:val="2C5F8A"/>
-          <w:sz w:val="22"/>
-          <w:szCs w:val="22"/>
-        </w:rPr>
-      </w:pPr>
-    </w:p>
-    <w:p>
-      <w:pPr>
-        <w:pBdr>
-          <w:bottom w:val="single" w:sz="6" w:space="4" w:color="2C5F8A"/>
-        </w:pBdr>
-        <w:tabs>
-          <w:tab w:val="left" w:pos="3660"/>
-        </w:tabs>
-        <w:spacing w:before="280" w:after="100"/>
         <w:rPr>
           <w:b/>
           <w:bCs/>
@@ -4479,6 +4519,17 @@
           <w:sz w:val="22"/>
           <w:szCs w:val="22"/>
         </w:rPr>
+        <w:br w:type="page"/>
+      </w:r>
+      <w:r>
+        <w:rPr>
+          <w:b/>
+          <w:bCs/>
+          <w:color w:val="2C5F8A"/>
+          <w:sz w:val="22"/>
+          <w:szCs w:val="22"/>
+        </w:rPr>
+        <w:lastRenderedPageBreak/>
         <w:t>6. ASSINATURAS</w:t>
       </w:r>
       <w:r>
@@ -4491,6 +4542,17 @@
         </w:rPr>
         <w:tab/>
       </w:r>
+    </w:p>
+    <w:p>
+      <w:pPr>
+        <w:rPr>
+          <w:b/>
+          <w:bCs/>
+          <w:color w:val="2C5F8A"/>
+          <w:sz w:val="22"/>
+          <w:szCs w:val="22"/>
+        </w:rPr>
+      </w:pPr>
     </w:p>
     <w:tbl>
       <w:tblPr>
@@ -4647,28 +4709,6 @@
         </w:tc>
       </w:tr>
     </w:tbl>
-    <w:p>
-      <w:pPr>
-        <w:rPr>
-          <w:b/>
-          <w:bCs/>
-          <w:color w:val="2C5F8A"/>
-          <w:sz w:val="22"/>
-          <w:szCs w:val="22"/>
-        </w:rPr>
-      </w:pPr>
-    </w:p>
-    <w:p>
-      <w:pPr>
-        <w:rPr>
-          <w:b/>
-          <w:bCs/>
-          <w:color w:val="2C5F8A"/>
-          <w:sz w:val="22"/>
-          <w:szCs w:val="22"/>
-        </w:rPr>
-      </w:pPr>
-    </w:p>
     <w:p>
       <w:pPr>
         <w:rPr>
@@ -4709,7 +4749,6 @@
           <w:sz w:val="22"/>
           <w:szCs w:val="22"/>
         </w:rPr>
-        <w:lastRenderedPageBreak/>
         <w:t xml:space="preserve">7. </w:t>
       </w:r>
       <w:r>
@@ -5242,7 +5281,7 @@
   <w:style w:type="paragraph" w:default="1" w:styleId="Normal">
     <w:name w:val="Normal"/>
     <w:qFormat/>
-    <w:rsid w:val="00DA5E18"/>
+    <w:rsid w:val="00105CB5"/>
   </w:style>
   <w:style w:type="paragraph" w:styleId="Ttulo1">
     <w:name w:val="heading 1"/>

</xml_diff>